<commit_message>
Minor Edit to Piece 5
</commit_message>
<xml_diff>
--- a/Working Folder/[Reviewed] 5 Lee Ji Heng 李智恒 - Dark Light 黑光/v1/5 Lee Ji Heng 李智恒 - Dark Light 黑光 - Errata_v1.docx
+++ b/Working Folder/[Reviewed] 5 Lee Ji Heng 李智恒 - Dark Light 黑光/v1/5 Lee Ji Heng 李智恒 - Dark Light 黑光 - Errata_v1.docx
@@ -822,7 +822,6 @@
               </w:rPr>
               <w:t xml:space="preserve">Would it be more clear to instead use a crescendo from niente sign instead, and push back the </w:t>
             </w:r>
-            <w:proofErr w:type="spellStart"/>
             <w:r>
               <w:rPr>
                 <w:rFonts w:ascii="Times" w:eastAsia="Times" w:hAnsi="Times" w:cs="Times"/>
@@ -833,7 +832,6 @@
               </w:rPr>
               <w:t>ppp</w:t>
             </w:r>
-            <w:proofErr w:type="spellEnd"/>
             <w:r>
               <w:rPr>
                 <w:rFonts w:ascii="Times" w:eastAsia="Times" w:hAnsi="Times" w:cs="Times"/>
@@ -998,23 +996,7 @@
                 <w:rFonts w:ascii="Times" w:eastAsia="Times" w:hAnsi="Times" w:cs="Times"/>
                 <w:color w:val="FF0000"/>
               </w:rPr>
-              <w:t xml:space="preserve">Apologies for this. Perhaps F# C# (‘D major’) could work. The harmony in the strings largely follows a pitch set [G C </w:t>
-            </w:r>
-            <w:proofErr w:type="spellStart"/>
-            <w:r>
-              <w:rPr>
-                <w:rFonts w:ascii="Times" w:eastAsia="Times" w:hAnsi="Times" w:cs="Times"/>
-                <w:color w:val="FF0000"/>
-              </w:rPr>
-              <w:t>C</w:t>
-            </w:r>
-            <w:proofErr w:type="spellEnd"/>
-            <w:r>
-              <w:rPr>
-                <w:rFonts w:ascii="Times" w:eastAsia="Times" w:hAnsi="Times" w:cs="Times"/>
-                <w:color w:val="FF0000"/>
-              </w:rPr>
-              <w:t># D F#]</w:t>
+              <w:t>Apologies for this. Perhaps F# C# (‘D major’) could work. The harmony in the strings largely follows a pitch set [G C C# D F#]</w:t>
             </w:r>
           </w:p>
         </w:tc>
@@ -1145,15 +1127,11 @@
               <w:jc w:val="center"/>
               <w:rPr>
                 <w:rFonts w:ascii="Times" w:eastAsia="Times" w:hAnsi="Times" w:cs="Times"/>
-                <w:b/>
-                <w:bCs/>
-              </w:rPr>
-            </w:pPr>
-            <w:r>
-              <w:rPr>
-                <w:rFonts w:ascii="Times" w:eastAsia="Times" w:hAnsi="Times" w:cs="Times"/>
-                <w:b/>
-                <w:bCs/>
+              </w:rPr>
+            </w:pPr>
+            <w:r>
+              <w:rPr>
+                <w:rFonts w:ascii="Times" w:eastAsia="Times" w:hAnsi="Times" w:cs="Times"/>
               </w:rPr>
               <w:t>38</w:t>
             </w:r>
@@ -1183,7 +1161,6 @@
               <w:spacing w:before="0" w:beforeAutospacing="0" w:after="0" w:afterAutospacing="0" w:line="216" w:lineRule="auto"/>
               <w:jc w:val="center"/>
             </w:pPr>
-            <w:proofErr w:type="spellStart"/>
             <w:r>
               <w:rPr>
                 <w:rFonts w:ascii="MS Mincho" w:eastAsia="MS Mincho" w:hAnsi="MS Mincho" w:cs="MS Mincho" w:hint="eastAsia"/>
@@ -1196,7 +1173,6 @@
               </w:rPr>
               <w:t>击乐</w:t>
             </w:r>
-            <w:proofErr w:type="spellEnd"/>
             <w:r>
               <w:t xml:space="preserve"> IV, V</w:t>
             </w:r>
@@ -1224,21 +1200,7 @@
               <w:rPr>
                 <w:rFonts w:ascii="Times" w:eastAsia="Times" w:hAnsi="Times" w:cs="Times"/>
               </w:rPr>
-              <w:t xml:space="preserve">What’s the best way to say the upper half for </w:t>
-            </w:r>
-            <w:proofErr w:type="spellStart"/>
-            <w:r>
-              <w:rPr>
-                <w:rFonts w:ascii="Times" w:eastAsia="Times" w:hAnsi="Times" w:cs="Times"/>
-              </w:rPr>
-              <w:t>Bianzhong</w:t>
-            </w:r>
-            <w:proofErr w:type="spellEnd"/>
-            <w:r>
-              <w:rPr>
-                <w:rFonts w:ascii="Times" w:eastAsia="Times" w:hAnsi="Times" w:cs="Times"/>
-              </w:rPr>
-              <w:t xml:space="preserve"> (like in the Chinese description?)</w:t>
+              <w:t>What’s the best way to say the upper half for Bianzhong (like in the Chinese description?)</w:t>
             </w:r>
           </w:p>
           <w:p>
@@ -1504,7 +1466,6 @@
               </w:rPr>
               <w:t xml:space="preserve">Added dim. to </w:t>
             </w:r>
-            <w:proofErr w:type="spellStart"/>
             <w:r>
               <w:rPr>
                 <w:rFonts w:ascii="Times" w:eastAsia="Times" w:hAnsi="Times" w:cs="Times"/>
@@ -1515,7 +1476,6 @@
               </w:rPr>
               <w:t>mp</w:t>
             </w:r>
-            <w:proofErr w:type="spellEnd"/>
             <w:r>
               <w:rPr>
                 <w:rFonts w:ascii="Times" w:eastAsia="Times" w:hAnsi="Times" w:cs="Times"/>
@@ -1723,15 +1683,7 @@
                 <w:rFonts w:ascii="Times New Roman" w:hAnsi="Times New Roman" w:cs="Times New Roman"/>
                 <w:color w:val="FF0000"/>
               </w:rPr>
-              <w:t xml:space="preserve">you raised a good point about the effectiveness of the crescendo at m.84. Could you kindly help me mark in a drop </w:t>
-            </w:r>
-            <w:proofErr w:type="spellStart"/>
-            <w:r>
-              <w:rPr>
-                <w:rFonts w:ascii="Times New Roman" w:hAnsi="Times New Roman" w:cs="Times New Roman"/>
-                <w:color w:val="FF0000"/>
-              </w:rPr>
-              <w:t xml:space="preserve">to </w:t>
+              <w:t xml:space="preserve">you raised a good point about the effectiveness of the crescendo at m.84. Could you kindly help me mark in a drop to </w:t>
             </w:r>
             <w:r>
               <w:rPr>
@@ -1744,7 +1696,6 @@
               </w:rPr>
               <w:t>p</w:t>
             </w:r>
-            <w:proofErr w:type="spellEnd"/>
             <w:r>
               <w:rPr>
                 <w:rFonts w:ascii="Times New Roman" w:hAnsi="Times New Roman" w:cs="Times New Roman"/>
@@ -1752,7 +1703,6 @@
               </w:rPr>
               <w:t xml:space="preserve"> for cellos &amp; basses at m.82, such that it allows them to crescendo to </w:t>
             </w:r>
-            <w:proofErr w:type="spellStart"/>
             <w:r>
               <w:rPr>
                 <w:rFonts w:ascii="Times New Roman" w:hAnsi="Times New Roman" w:cs="Times New Roman"/>
@@ -1764,7 +1714,6 @@
               </w:rPr>
               <w:t>fff</w:t>
             </w:r>
-            <w:proofErr w:type="spellEnd"/>
             <w:r>
               <w:rPr>
                 <w:rFonts w:ascii="Times New Roman" w:hAnsi="Times New Roman" w:cs="Times New Roman"/>
@@ -1831,21 +1780,7 @@
               <w:rPr>
                 <w:rFonts w:ascii="Times" w:eastAsia="Times" w:hAnsi="Times" w:cs="Times"/>
               </w:rPr>
-              <w:t>Is the woodblock (</w:t>
-            </w:r>
-            <w:proofErr w:type="spellStart"/>
-            <w:r>
-              <w:rPr>
-                <w:rFonts w:ascii="Times" w:eastAsia="Times" w:hAnsi="Times" w:cs="Times"/>
-              </w:rPr>
-              <w:t>Muyu</w:t>
-            </w:r>
-            <w:proofErr w:type="spellEnd"/>
-            <w:r>
-              <w:rPr>
-                <w:rFonts w:ascii="Times" w:eastAsia="Times" w:hAnsi="Times" w:cs="Times"/>
-              </w:rPr>
-              <w:t>) supposed to be single line staff?</w:t>
+              <w:t>Is the woodblock (Muyu) supposed to be single line staff?</w:t>
             </w:r>
             <w:r>
               <w:rPr>
@@ -1858,21 +1793,7 @@
                 <w:rFonts w:ascii="Times" w:eastAsia="Times" w:hAnsi="Times" w:cs="Times"/>
               </w:rPr>
               <w:lastRenderedPageBreak/>
-              <w:t xml:space="preserve">keep it as just </w:t>
-            </w:r>
-            <w:proofErr w:type="spellStart"/>
-            <w:r>
-              <w:rPr>
-                <w:rFonts w:ascii="Times" w:eastAsia="Times" w:hAnsi="Times" w:cs="Times"/>
-              </w:rPr>
-              <w:t>Muyu</w:t>
-            </w:r>
-            <w:proofErr w:type="spellEnd"/>
-            <w:r>
-              <w:rPr>
-                <w:rFonts w:ascii="Times" w:eastAsia="Times" w:hAnsi="Times" w:cs="Times"/>
-              </w:rPr>
-              <w:t xml:space="preserve"> or is woodblock preferable?)</w:t>
+              <w:t>keep it as just Muyu or is woodblock preferable?)</w:t>
             </w:r>
           </w:p>
         </w:tc>
@@ -1969,28 +1890,12 @@
                 <w:rFonts w:ascii="Times" w:eastAsia="Times" w:hAnsi="Times" w:cs="Times"/>
               </w:rPr>
             </w:pPr>
-            <w:proofErr w:type="spellStart"/>
-            <w:r>
-              <w:rPr>
-                <w:rFonts w:ascii="Times" w:eastAsia="Times" w:hAnsi="Times" w:cs="Times"/>
-              </w:rPr>
-              <w:t>Vc</w:t>
-            </w:r>
-            <w:proofErr w:type="spellEnd"/>
-            <w:r>
-              <w:rPr>
-                <w:rFonts w:ascii="Times" w:eastAsia="Times" w:hAnsi="Times" w:cs="Times"/>
-              </w:rPr>
-              <w:t xml:space="preserve">, </w:t>
-            </w:r>
-            <w:proofErr w:type="spellStart"/>
-            <w:r>
-              <w:rPr>
-                <w:rFonts w:ascii="Times" w:eastAsia="Times" w:hAnsi="Times" w:cs="Times"/>
-              </w:rPr>
-              <w:t>Cb</w:t>
-            </w:r>
-            <w:proofErr w:type="spellEnd"/>
+            <w:r>
+              <w:rPr>
+                <w:rFonts w:ascii="Times" w:eastAsia="Times" w:hAnsi="Times" w:cs="Times"/>
+              </w:rPr>
+              <w:t>Vc, Cb</w:t>
+            </w:r>
           </w:p>
         </w:tc>
         <w:tc>
@@ -2152,31 +2057,13 @@
                 <w:lang w:val="en-US"/>
               </w:rPr>
             </w:pPr>
-            <w:proofErr w:type="spellStart"/>
             <w:r>
               <w:rPr>
                 <w:rFonts w:ascii="MS Mincho" w:eastAsia="MS Mincho" w:hAnsi="MS Mincho" w:cs="MS Mincho"/>
                 <w:lang w:val="en-US"/>
               </w:rPr>
-              <w:t>Vc</w:t>
-            </w:r>
-            <w:proofErr w:type="spellEnd"/>
-            <w:r>
-              <w:rPr>
-                <w:rFonts w:ascii="MS Mincho" w:eastAsia="MS Mincho" w:hAnsi="MS Mincho" w:cs="MS Mincho"/>
-                <w:lang w:val="en-US"/>
-              </w:rPr>
-              <w:t xml:space="preserve">, </w:t>
-            </w:r>
-            <w:proofErr w:type="spellStart"/>
-            <w:r>
-              <w:rPr>
-                <w:rFonts w:ascii="MS Mincho" w:eastAsia="MS Mincho" w:hAnsi="MS Mincho" w:cs="MS Mincho"/>
-                <w:lang w:val="en-US"/>
-              </w:rPr>
-              <w:t>Cb</w:t>
-            </w:r>
-            <w:proofErr w:type="spellEnd"/>
+              <w:t>Vc, Cb</w:t>
+            </w:r>
           </w:p>
         </w:tc>
         <w:tc>

</xml_diff>